<commit_message>
Added to the design document
</commit_message>
<xml_diff>
--- a/Design_Template.docx
+++ b/Design_Template.docx
@@ -138,6 +138,126 @@
           <w:lang w:val="en-ZA"/>
         </w:rPr>
       </w:pPr>
+      <w:r>
+        <w:rPr>
+          <w:lang w:val="en-ZA"/>
+        </w:rPr>
+        <w:t>Number of households</w:t>
+      </w:r>
+    </w:p>
+    <w:p>
+      <w:pPr>
+        <w:pStyle w:val="ListParagraph"/>
+        <w:numPr>
+          <w:ilvl w:val="0"/>
+          <w:numId w:val="1"/>
+        </w:numPr>
+        <w:rPr>
+          <w:lang w:val="en-ZA"/>
+        </w:rPr>
+      </w:pPr>
+      <w:r>
+        <w:rPr>
+          <w:lang w:val="en-ZA"/>
+        </w:rPr>
+        <w:t>Number of boreholes</w:t>
+      </w:r>
+    </w:p>
+    <w:p>
+      <w:pPr>
+        <w:pStyle w:val="ListParagraph"/>
+        <w:numPr>
+          <w:ilvl w:val="0"/>
+          <w:numId w:val="1"/>
+        </w:numPr>
+        <w:rPr>
+          <w:lang w:val="en-ZA"/>
+        </w:rPr>
+      </w:pPr>
+      <w:r>
+        <w:rPr>
+          <w:lang w:val="en-ZA"/>
+        </w:rPr>
+        <w:t xml:space="preserve">Maximum </w:t>
+      </w:r>
+      <w:r>
+        <w:rPr>
+          <w:lang w:val="en-ZA"/>
+        </w:rPr>
+        <w:t>tap usage</w:t>
+      </w:r>
+    </w:p>
+    <w:p>
+      <w:pPr>
+        <w:pStyle w:val="ListParagraph"/>
+        <w:numPr>
+          <w:ilvl w:val="0"/>
+          <w:numId w:val="1"/>
+        </w:numPr>
+        <w:rPr>
+          <w:lang w:val="en-ZA"/>
+        </w:rPr>
+      </w:pPr>
+      <w:r>
+        <w:rPr>
+          <w:lang w:val="en-ZA"/>
+        </w:rPr>
+        <w:t>Maximum dam capacity</w:t>
+      </w:r>
+    </w:p>
+    <w:p>
+      <w:pPr>
+        <w:pStyle w:val="ListParagraph"/>
+        <w:numPr>
+          <w:ilvl w:val="0"/>
+          <w:numId w:val="1"/>
+        </w:numPr>
+        <w:rPr>
+          <w:lang w:val="en-ZA"/>
+        </w:rPr>
+      </w:pPr>
+      <w:r>
+        <w:rPr>
+          <w:lang w:val="en-ZA"/>
+        </w:rPr>
+        <w:t>Household choice</w:t>
+      </w:r>
+    </w:p>
+    <w:p>
+      <w:pPr>
+        <w:pStyle w:val="ListParagraph"/>
+        <w:numPr>
+          <w:ilvl w:val="0"/>
+          <w:numId w:val="1"/>
+        </w:numPr>
+        <w:rPr>
+          <w:lang w:val="en-ZA"/>
+        </w:rPr>
+      </w:pPr>
+      <w:r>
+        <w:rPr>
+          <w:lang w:val="en-ZA"/>
+        </w:rPr>
+        <w:t>Borehole choice</w:t>
+      </w:r>
+    </w:p>
+    <w:p>
+      <w:pPr>
+        <w:pStyle w:val="ListParagraph"/>
+        <w:numPr>
+          <w:ilvl w:val="0"/>
+          <w:numId w:val="1"/>
+        </w:numPr>
+        <w:rPr>
+          <w:lang w:val="en-ZA"/>
+        </w:rPr>
+      </w:pPr>
+      <w:r>
+        <w:rPr>
+          <w:lang w:val="en-ZA"/>
+        </w:rPr>
+        <w:t>Amount of water used</w:t>
+      </w:r>
     </w:p>
     <w:p>
       <w:pPr>
@@ -164,6 +284,108 @@
           <w:lang w:val="en-ZA"/>
         </w:rPr>
       </w:pPr>
+      <w:r>
+        <w:rPr>
+          <w:lang w:val="en-ZA"/>
+        </w:rPr>
+        <w:t>Dam ID</w:t>
+      </w:r>
+    </w:p>
+    <w:p>
+      <w:pPr>
+        <w:pStyle w:val="ListParagraph"/>
+        <w:numPr>
+          <w:ilvl w:val="0"/>
+          <w:numId w:val="2"/>
+        </w:numPr>
+        <w:rPr>
+          <w:lang w:val="en-ZA"/>
+        </w:rPr>
+      </w:pPr>
+      <w:r>
+        <w:rPr>
+          <w:lang w:val="en-ZA"/>
+        </w:rPr>
+        <w:t>Maximum Capacity of Dam</w:t>
+      </w:r>
+    </w:p>
+    <w:p>
+      <w:pPr>
+        <w:pStyle w:val="ListParagraph"/>
+        <w:numPr>
+          <w:ilvl w:val="0"/>
+          <w:numId w:val="2"/>
+        </w:numPr>
+        <w:rPr>
+          <w:lang w:val="en-ZA"/>
+        </w:rPr>
+      </w:pPr>
+      <w:r>
+        <w:rPr>
+          <w:lang w:val="en-ZA"/>
+        </w:rPr>
+        <w:t>Available Amount of Dam</w:t>
+      </w:r>
+    </w:p>
+    <w:p>
+      <w:pPr>
+        <w:pStyle w:val="ListParagraph"/>
+        <w:numPr>
+          <w:ilvl w:val="0"/>
+          <w:numId w:val="2"/>
+        </w:numPr>
+        <w:rPr>
+          <w:lang w:val="en-ZA"/>
+        </w:rPr>
+      </w:pPr>
+      <w:r>
+        <w:rPr>
+          <w:lang w:val="en-ZA"/>
+        </w:rPr>
+        <w:t>Household ID</w:t>
+      </w:r>
+    </w:p>
+    <w:p>
+      <w:pPr>
+        <w:pStyle w:val="ListParagraph"/>
+        <w:numPr>
+          <w:ilvl w:val="0"/>
+          <w:numId w:val="2"/>
+        </w:numPr>
+        <w:rPr>
+          <w:lang w:val="en-ZA"/>
+        </w:rPr>
+      </w:pPr>
+      <w:r>
+        <w:rPr>
+          <w:lang w:val="en-ZA"/>
+        </w:rPr>
+        <w:t>Tap ID</w:t>
+      </w:r>
+    </w:p>
+    <w:p>
+      <w:pPr>
+        <w:pStyle w:val="ListParagraph"/>
+        <w:numPr>
+          <w:ilvl w:val="0"/>
+          <w:numId w:val="2"/>
+        </w:numPr>
+        <w:rPr>
+          <w:lang w:val="en-ZA"/>
+        </w:rPr>
+      </w:pPr>
+      <w:r>
+        <w:rPr>
+          <w:lang w:val="en-ZA"/>
+        </w:rPr>
+        <w:t>Available amount in household</w:t>
+      </w:r>
+      <w:r>
+        <w:rPr>
+          <w:lang w:val="en-ZA"/>
+        </w:rPr>
+        <w:t xml:space="preserve"> tap</w:t>
+      </w:r>
     </w:p>
     <w:p>
       <w:pPr>
@@ -256,6 +478,12 @@
               <w:t>btnInit</w:t>
             </w:r>
             <w:proofErr w:type="spellEnd"/>
+            <w:r>
+              <w:rPr>
+                <w:lang w:val="en-ZA"/>
+              </w:rPr>
+              <w:t xml:space="preserve"> is clicked</w:t>
+            </w:r>
           </w:p>
         </w:tc>
         <w:tc>
@@ -274,6 +502,170 @@
                 <w:lang w:val="en-ZA"/>
               </w:rPr>
             </w:pPr>
+            <w:r>
+              <w:rPr>
+                <w:lang w:val="en-ZA"/>
+              </w:rPr>
+              <w:t>Get number of households</w:t>
+            </w:r>
+          </w:p>
+          <w:p>
+            <w:pPr>
+              <w:pStyle w:val="ListParagraph"/>
+              <w:numPr>
+                <w:ilvl w:val="0"/>
+                <w:numId w:val="3"/>
+              </w:numPr>
+              <w:cnfStyle w:val="000000100000" w:firstRow="0" w:lastRow="0" w:firstColumn="0" w:lastColumn="0" w:oddVBand="0" w:evenVBand="0" w:oddHBand="1" w:evenHBand="0" w:firstRowFirstColumn="0" w:firstRowLastColumn="0" w:lastRowFirstColumn="0" w:lastRowLastColumn="0"/>
+              <w:rPr>
+                <w:lang w:val="en-ZA"/>
+              </w:rPr>
+            </w:pPr>
+            <w:r>
+              <w:rPr>
+                <w:lang w:val="en-ZA"/>
+              </w:rPr>
+              <w:t>Get number of boreholes</w:t>
+            </w:r>
+          </w:p>
+          <w:p>
+            <w:pPr>
+              <w:pStyle w:val="ListParagraph"/>
+              <w:numPr>
+                <w:ilvl w:val="0"/>
+                <w:numId w:val="3"/>
+              </w:numPr>
+              <w:cnfStyle w:val="000000100000" w:firstRow="0" w:lastRow="0" w:firstColumn="0" w:lastColumn="0" w:oddVBand="0" w:evenVBand="0" w:oddHBand="1" w:evenHBand="0" w:firstRowFirstColumn="0" w:firstRowLastColumn="0" w:lastRowFirstColumn="0" w:lastRowLastColumn="0"/>
+              <w:rPr>
+                <w:lang w:val="en-ZA"/>
+              </w:rPr>
+            </w:pPr>
+            <w:r>
+              <w:rPr>
+                <w:lang w:val="en-ZA"/>
+              </w:rPr>
+              <w:t xml:space="preserve">Get </w:t>
+            </w:r>
+            <w:r>
+              <w:rPr>
+                <w:lang w:val="en-ZA"/>
+              </w:rPr>
+              <w:t>max tap usage</w:t>
+            </w:r>
+          </w:p>
+          <w:p>
+            <w:pPr>
+              <w:pStyle w:val="ListParagraph"/>
+              <w:numPr>
+                <w:ilvl w:val="0"/>
+                <w:numId w:val="3"/>
+              </w:numPr>
+              <w:cnfStyle w:val="000000100000" w:firstRow="0" w:lastRow="0" w:firstColumn="0" w:lastColumn="0" w:oddVBand="0" w:evenVBand="0" w:oddHBand="1" w:evenHBand="0" w:firstRowFirstColumn="0" w:firstRowLastColumn="0" w:lastRowFirstColumn="0" w:lastRowLastColumn="0"/>
+              <w:rPr>
+                <w:lang w:val="en-ZA"/>
+              </w:rPr>
+            </w:pPr>
+            <w:r>
+              <w:rPr>
+                <w:lang w:val="en-ZA"/>
+              </w:rPr>
+              <w:t>Get max dam capacity</w:t>
+            </w:r>
+          </w:p>
+          <w:p>
+            <w:pPr>
+              <w:pStyle w:val="ListParagraph"/>
+              <w:numPr>
+                <w:ilvl w:val="0"/>
+                <w:numId w:val="3"/>
+              </w:numPr>
+              <w:cnfStyle w:val="000000100000" w:firstRow="0" w:lastRow="0" w:firstColumn="0" w:lastColumn="0" w:oddVBand="0" w:evenVBand="0" w:oddHBand="1" w:evenHBand="0" w:firstRowFirstColumn="0" w:firstRowLastColumn="0" w:lastRowFirstColumn="0" w:lastRowLastColumn="0"/>
+              <w:rPr>
+                <w:lang w:val="en-ZA"/>
+              </w:rPr>
+            </w:pPr>
+            <w:r>
+              <w:rPr>
+                <w:lang w:val="en-ZA"/>
+              </w:rPr>
+              <w:t>Instantiate dam</w:t>
+            </w:r>
+          </w:p>
+          <w:p>
+            <w:pPr>
+              <w:pStyle w:val="ListParagraph"/>
+              <w:numPr>
+                <w:ilvl w:val="0"/>
+                <w:numId w:val="3"/>
+              </w:numPr>
+              <w:cnfStyle w:val="000000100000" w:firstRow="0" w:lastRow="0" w:firstColumn="0" w:lastColumn="0" w:oddVBand="0" w:evenVBand="0" w:oddHBand="1" w:evenHBand="0" w:firstRowFirstColumn="0" w:firstRowLastColumn="0" w:lastRowFirstColumn="0" w:lastRowLastColumn="0"/>
+              <w:rPr>
+                <w:lang w:val="en-ZA"/>
+              </w:rPr>
+            </w:pPr>
+            <w:r>
+              <w:rPr>
+                <w:lang w:val="en-ZA"/>
+              </w:rPr>
+              <w:t>Instantiate each household</w:t>
+            </w:r>
+          </w:p>
+          <w:p>
+            <w:pPr>
+              <w:pStyle w:val="ListParagraph"/>
+              <w:numPr>
+                <w:ilvl w:val="0"/>
+                <w:numId w:val="3"/>
+              </w:numPr>
+              <w:cnfStyle w:val="000000100000" w:firstRow="0" w:lastRow="0" w:firstColumn="0" w:lastColumn="0" w:oddVBand="0" w:evenVBand="0" w:oddHBand="1" w:evenHBand="0" w:firstRowFirstColumn="0" w:firstRowLastColumn="0" w:lastRowFirstColumn="0" w:lastRowLastColumn="0"/>
+              <w:rPr>
+                <w:lang w:val="en-ZA"/>
+              </w:rPr>
+            </w:pPr>
+            <w:r>
+              <w:rPr>
+                <w:lang w:val="en-ZA"/>
+              </w:rPr>
+              <w:t>Instantiate each borehole</w:t>
+            </w:r>
+          </w:p>
+          <w:p>
+            <w:pPr>
+              <w:pStyle w:val="ListParagraph"/>
+              <w:numPr>
+                <w:ilvl w:val="0"/>
+                <w:numId w:val="3"/>
+              </w:numPr>
+              <w:cnfStyle w:val="000000100000" w:firstRow="0" w:lastRow="0" w:firstColumn="0" w:lastColumn="0" w:oddVBand="0" w:evenVBand="0" w:oddHBand="1" w:evenHBand="0" w:firstRowFirstColumn="0" w:firstRowLastColumn="0" w:lastRowFirstColumn="0" w:lastRowLastColumn="0"/>
+              <w:rPr>
+                <w:lang w:val="en-ZA"/>
+              </w:rPr>
+            </w:pPr>
+            <w:r>
+              <w:rPr>
+                <w:lang w:val="en-ZA"/>
+              </w:rPr>
+              <w:t>Set current day to one</w:t>
+            </w:r>
+          </w:p>
+          <w:p>
+            <w:pPr>
+              <w:pStyle w:val="ListParagraph"/>
+              <w:numPr>
+                <w:ilvl w:val="0"/>
+                <w:numId w:val="3"/>
+              </w:numPr>
+              <w:cnfStyle w:val="000000100000" w:firstRow="0" w:lastRow="0" w:firstColumn="0" w:lastColumn="0" w:oddVBand="0" w:evenVBand="0" w:oddHBand="1" w:evenHBand="0" w:firstRowFirstColumn="0" w:firstRowLastColumn="0" w:lastRowFirstColumn="0" w:lastRowLastColumn="0"/>
+              <w:rPr>
+                <w:lang w:val="en-ZA"/>
+              </w:rPr>
+            </w:pPr>
+            <w:r>
+              <w:rPr>
+                <w:lang w:val="en-ZA"/>
+              </w:rPr>
+              <w:t>Show current usage details of each dam and each borehole</w:t>
+            </w:r>
           </w:p>
         </w:tc>
       </w:tr>
@@ -285,22 +677,167 @@
           </w:tcPr>
           <w:p>
             <w:pPr>
+              <w:jc w:val="left"/>
               <w:rPr>
                 <w:lang w:val="en-ZA"/>
               </w:rPr>
             </w:pPr>
             <w:proofErr w:type="spellStart"/>
             <w:r>
-              <w:rPr>
-                <w:lang w:val="en-ZA"/>
-              </w:rPr>
-              <w:t>btnAdd</w:t>
+              <w:t>btnHouseProfile</w:t>
+            </w:r>
+            <w:proofErr w:type="spellEnd"/>
+            <w:r>
+              <w:t xml:space="preserve"> </w:t>
             </w:r>
             <w:r>
-              <w:rPr>
-                <w:lang w:val="en-ZA"/>
-              </w:rPr>
-              <w:t>Household</w:t>
+              <w:t>is clicked</w:t>
+            </w:r>
+          </w:p>
+        </w:tc>
+        <w:tc>
+          <w:tcPr>
+            <w:tcW w:w="6378" w:type="dxa"/>
+          </w:tcPr>
+          <w:p>
+            <w:pPr>
+              <w:pStyle w:val="ListParagraph"/>
+              <w:numPr>
+                <w:ilvl w:val="0"/>
+                <w:numId w:val="3"/>
+              </w:numPr>
+              <w:cnfStyle w:val="000000000000" w:firstRow="0" w:lastRow="0" w:firstColumn="0" w:lastColumn="0" w:oddVBand="0" w:evenVBand="0" w:oddHBand="0" w:evenHBand="0" w:firstRowFirstColumn="0" w:firstRowLastColumn="0" w:lastRowFirstColumn="0" w:lastRowLastColumn="0"/>
+              <w:rPr>
+                <w:lang w:val="en-ZA"/>
+              </w:rPr>
+            </w:pPr>
+            <w:r>
+              <w:rPr>
+                <w:lang w:val="en-ZA"/>
+              </w:rPr>
+              <w:t>Display household ID</w:t>
+            </w:r>
+          </w:p>
+          <w:p>
+            <w:pPr>
+              <w:pStyle w:val="ListParagraph"/>
+              <w:numPr>
+                <w:ilvl w:val="0"/>
+                <w:numId w:val="3"/>
+              </w:numPr>
+              <w:cnfStyle w:val="000000000000" w:firstRow="0" w:lastRow="0" w:firstColumn="0" w:lastColumn="0" w:oddVBand="0" w:evenVBand="0" w:oddHBand="0" w:evenHBand="0" w:firstRowFirstColumn="0" w:firstRowLastColumn="0" w:lastRowFirstColumn="0" w:lastRowLastColumn="0"/>
+              <w:rPr>
+                <w:lang w:val="en-ZA"/>
+              </w:rPr>
+            </w:pPr>
+            <w:r>
+              <w:rPr>
+                <w:lang w:val="en-ZA"/>
+              </w:rPr>
+              <w:t>Display available amount in household</w:t>
+            </w:r>
+          </w:p>
+        </w:tc>
+      </w:tr>
+      <w:tr>
+        <w:trPr>
+          <w:cnfStyle w:val="000000100000" w:firstRow="0" w:lastRow="0" w:firstColumn="0" w:lastColumn="0" w:oddVBand="0" w:evenVBand="0" w:oddHBand="1" w:evenHBand="0" w:firstRowFirstColumn="0" w:firstRowLastColumn="0" w:lastRowFirstColumn="0" w:lastRowLastColumn="0"/>
+        </w:trPr>
+        <w:tc>
+          <w:tcPr>
+            <w:cnfStyle w:val="001000000000" w:firstRow="0" w:lastRow="0" w:firstColumn="1" w:lastColumn="0" w:oddVBand="0" w:evenVBand="0" w:oddHBand="0" w:evenHBand="0" w:firstRowFirstColumn="0" w:firstRowLastColumn="0" w:lastRowFirstColumn="0" w:lastRowLastColumn="0"/>
+            <w:tcW w:w="2972" w:type="dxa"/>
+          </w:tcPr>
+          <w:p>
+            <w:pPr>
+              <w:jc w:val="left"/>
+            </w:pPr>
+            <w:proofErr w:type="spellStart"/>
+            <w:r>
+              <w:t>btnHouseWater</w:t>
+            </w:r>
+            <w:proofErr w:type="spellEnd"/>
+            <w:r>
+              <w:t xml:space="preserve"> is clicked</w:t>
+            </w:r>
+          </w:p>
+        </w:tc>
+        <w:tc>
+          <w:tcPr>
+            <w:tcW w:w="6378" w:type="dxa"/>
+          </w:tcPr>
+          <w:p>
+            <w:pPr>
+              <w:pStyle w:val="ListParagraph"/>
+              <w:numPr>
+                <w:ilvl w:val="0"/>
+                <w:numId w:val="3"/>
+              </w:numPr>
+              <w:cnfStyle w:val="000000100000" w:firstRow="0" w:lastRow="0" w:firstColumn="0" w:lastColumn="0" w:oddVBand="0" w:evenVBand="0" w:oddHBand="1" w:evenHBand="0" w:firstRowFirstColumn="0" w:firstRowLastColumn="0" w:lastRowFirstColumn="0" w:lastRowLastColumn="0"/>
+              <w:rPr>
+                <w:lang w:val="en-ZA"/>
+              </w:rPr>
+            </w:pPr>
+            <w:r>
+              <w:rPr>
+                <w:lang w:val="en-ZA"/>
+              </w:rPr>
+              <w:t>Get household choice from user</w:t>
+            </w:r>
+          </w:p>
+          <w:p>
+            <w:pPr>
+              <w:pStyle w:val="ListParagraph"/>
+              <w:numPr>
+                <w:ilvl w:val="0"/>
+                <w:numId w:val="3"/>
+              </w:numPr>
+              <w:cnfStyle w:val="000000100000" w:firstRow="0" w:lastRow="0" w:firstColumn="0" w:lastColumn="0" w:oddVBand="0" w:evenVBand="0" w:oddHBand="1" w:evenHBand="0" w:firstRowFirstColumn="0" w:firstRowLastColumn="0" w:lastRowFirstColumn="0" w:lastRowLastColumn="0"/>
+              <w:rPr>
+                <w:lang w:val="en-ZA"/>
+              </w:rPr>
+            </w:pPr>
+            <w:r>
+              <w:rPr>
+                <w:lang w:val="en-ZA"/>
+              </w:rPr>
+              <w:t>Get amount of water used from user</w:t>
+            </w:r>
+          </w:p>
+          <w:p>
+            <w:pPr>
+              <w:pStyle w:val="ListParagraph"/>
+              <w:numPr>
+                <w:ilvl w:val="0"/>
+                <w:numId w:val="3"/>
+              </w:numPr>
+              <w:cnfStyle w:val="000000100000" w:firstRow="0" w:lastRow="0" w:firstColumn="0" w:lastColumn="0" w:oddVBand="0" w:evenVBand="0" w:oddHBand="1" w:evenHBand="0" w:firstRowFirstColumn="0" w:firstRowLastColumn="0" w:lastRowFirstColumn="0" w:lastRowLastColumn="0"/>
+              <w:rPr>
+                <w:lang w:val="en-ZA"/>
+              </w:rPr>
+            </w:pPr>
+            <w:r>
+              <w:rPr>
+                <w:lang w:val="en-ZA"/>
+              </w:rPr>
+              <w:t>Reduce available amount in the household</w:t>
+            </w:r>
+          </w:p>
+        </w:tc>
+      </w:tr>
+      <w:tr>
+        <w:tc>
+          <w:tcPr>
+            <w:cnfStyle w:val="001000000000" w:firstRow="0" w:lastRow="0" w:firstColumn="1" w:lastColumn="0" w:oddVBand="0" w:evenVBand="0" w:oddHBand="0" w:evenHBand="0" w:firstRowFirstColumn="0" w:firstRowLastColumn="0" w:lastRowFirstColumn="0" w:lastRowLastColumn="0"/>
+            <w:tcW w:w="2972" w:type="dxa"/>
+          </w:tcPr>
+          <w:p>
+            <w:pPr>
+              <w:jc w:val="left"/>
+            </w:pPr>
+            <w:proofErr w:type="spellStart"/>
+            <w:r>
+              <w:t>btnUseBorehole</w:t>
             </w:r>
             <w:proofErr w:type="spellEnd"/>
           </w:p>
@@ -321,32 +858,139 @@
                 <w:lang w:val="en-ZA"/>
               </w:rPr>
             </w:pPr>
+            <w:r>
+              <w:rPr>
+                <w:lang w:val="en-ZA"/>
+              </w:rPr>
+              <w:t>Get household choice from user</w:t>
+            </w:r>
+          </w:p>
+          <w:p>
+            <w:pPr>
+              <w:pStyle w:val="ListParagraph"/>
+              <w:numPr>
+                <w:ilvl w:val="0"/>
+                <w:numId w:val="3"/>
+              </w:numPr>
+              <w:cnfStyle w:val="000000000000" w:firstRow="0" w:lastRow="0" w:firstColumn="0" w:lastColumn="0" w:oddVBand="0" w:evenVBand="0" w:oddHBand="0" w:evenHBand="0" w:firstRowFirstColumn="0" w:firstRowLastColumn="0" w:lastRowFirstColumn="0" w:lastRowLastColumn="0"/>
+              <w:rPr>
+                <w:lang w:val="en-ZA"/>
+              </w:rPr>
+            </w:pPr>
+            <w:r>
+              <w:rPr>
+                <w:lang w:val="en-ZA"/>
+              </w:rPr>
+              <w:t>Get borehole choice from user</w:t>
+            </w:r>
+          </w:p>
+          <w:p>
+            <w:pPr>
+              <w:pStyle w:val="ListParagraph"/>
+              <w:numPr>
+                <w:ilvl w:val="0"/>
+                <w:numId w:val="3"/>
+              </w:numPr>
+              <w:cnfStyle w:val="000000000000" w:firstRow="0" w:lastRow="0" w:firstColumn="0" w:lastColumn="0" w:oddVBand="0" w:evenVBand="0" w:oddHBand="0" w:evenHBand="0" w:firstRowFirstColumn="0" w:firstRowLastColumn="0" w:lastRowFirstColumn="0" w:lastRowLastColumn="0"/>
+              <w:rPr>
+                <w:lang w:val="en-ZA"/>
+              </w:rPr>
+            </w:pPr>
+            <w:r>
+              <w:rPr>
+                <w:lang w:val="en-ZA"/>
+              </w:rPr>
+              <w:t>Get amount of water used from user</w:t>
+            </w:r>
+          </w:p>
+          <w:p>
+            <w:pPr>
+              <w:pStyle w:val="ListParagraph"/>
+              <w:numPr>
+                <w:ilvl w:val="0"/>
+                <w:numId w:val="3"/>
+              </w:numPr>
+              <w:cnfStyle w:val="000000000000" w:firstRow="0" w:lastRow="0" w:firstColumn="0" w:lastColumn="0" w:oddVBand="0" w:evenVBand="0" w:oddHBand="0" w:evenHBand="0" w:firstRowFirstColumn="0" w:firstRowLastColumn="0" w:lastRowFirstColumn="0" w:lastRowLastColumn="0"/>
+              <w:rPr>
+                <w:lang w:val="en-ZA"/>
+              </w:rPr>
+            </w:pPr>
+            <w:r>
+              <w:rPr>
+                <w:lang w:val="en-ZA"/>
+              </w:rPr>
+              <w:t>Reduce available amount in the borehole</w:t>
+            </w:r>
+          </w:p>
+        </w:tc>
+      </w:tr>
+      <w:tr>
+        <w:trPr>
+          <w:cnfStyle w:val="000000100000" w:firstRow="0" w:lastRow="0" w:firstColumn="0" w:lastColumn="0" w:oddVBand="0" w:evenVBand="0" w:oddHBand="1" w:evenHBand="0" w:firstRowFirstColumn="0" w:firstRowLastColumn="0" w:lastRowFirstColumn="0" w:lastRowLastColumn="0"/>
+        </w:trPr>
+        <w:tc>
+          <w:tcPr>
+            <w:cnfStyle w:val="001000000000" w:firstRow="0" w:lastRow="0" w:firstColumn="1" w:lastColumn="0" w:oddVBand="0" w:evenVBand="0" w:oddHBand="0" w:evenHBand="0" w:firstRowFirstColumn="0" w:firstRowLastColumn="0" w:lastRowFirstColumn="0" w:lastRowLastColumn="0"/>
+            <w:tcW w:w="2972" w:type="dxa"/>
+          </w:tcPr>
+          <w:p>
+            <w:pPr>
+              <w:jc w:val="left"/>
+            </w:pPr>
+            <w:proofErr w:type="spellStart"/>
+            <w:r>
+              <w:t>btnNewDay</w:t>
+            </w:r>
+            <w:proofErr w:type="spellEnd"/>
+          </w:p>
+        </w:tc>
+        <w:tc>
+          <w:tcPr>
+            <w:tcW w:w="6378" w:type="dxa"/>
+          </w:tcPr>
+          <w:p>
+            <w:pPr>
+              <w:pStyle w:val="ListParagraph"/>
+              <w:numPr>
+                <w:ilvl w:val="0"/>
+                <w:numId w:val="3"/>
+              </w:numPr>
+              <w:cnfStyle w:val="000000100000" w:firstRow="0" w:lastRow="0" w:firstColumn="0" w:lastColumn="0" w:oddVBand="0" w:evenVBand="0" w:oddHBand="1" w:evenHBand="0" w:firstRowFirstColumn="0" w:firstRowLastColumn="0" w:lastRowFirstColumn="0" w:lastRowLastColumn="0"/>
+              <w:rPr>
+                <w:lang w:val="en-ZA"/>
+              </w:rPr>
+            </w:pPr>
+            <w:r>
+              <w:rPr>
+                <w:lang w:val="en-ZA"/>
+              </w:rPr>
+              <w:t>Move current day to the next</w:t>
+            </w:r>
+          </w:p>
+          <w:p>
+            <w:pPr>
+              <w:pStyle w:val="ListParagraph"/>
+              <w:numPr>
+                <w:ilvl w:val="0"/>
+                <w:numId w:val="3"/>
+              </w:numPr>
+              <w:cnfStyle w:val="000000100000" w:firstRow="0" w:lastRow="0" w:firstColumn="0" w:lastColumn="0" w:oddVBand="0" w:evenVBand="0" w:oddHBand="1" w:evenHBand="0" w:firstRowFirstColumn="0" w:firstRowLastColumn="0" w:lastRowFirstColumn="0" w:lastRowLastColumn="0"/>
+              <w:rPr>
+                <w:lang w:val="en-ZA"/>
+              </w:rPr>
+            </w:pPr>
+            <w:r>
+              <w:rPr>
+                <w:lang w:val="en-ZA"/>
+              </w:rPr>
+              <w:t>Reset borehole available amount each day</w:t>
+            </w:r>
           </w:p>
         </w:tc>
       </w:tr>
     </w:tbl>
     <w:p>
       <w:pPr>
-        <w:rPr>
-          <w:lang w:val="en-ZA"/>
-        </w:rPr>
-      </w:pPr>
-    </w:p>
-    <w:p>
-      <w:pPr>
-        <w:rPr>
-          <w:lang w:val="en-ZA"/>
-        </w:rPr>
-      </w:pPr>
-      <w:r>
-        <w:rPr>
-          <w:lang w:val="en-ZA"/>
-        </w:rPr>
-        <w:br w:type="page"/>
-      </w:r>
-    </w:p>
-    <w:p>
-      <w:pPr>
         <w:pStyle w:val="Heading5"/>
         <w:rPr>
           <w:lang w:val="en-ZA"/>
@@ -397,7 +1041,19 @@
         <w:rPr>
           <w:lang w:val="en-ZA"/>
         </w:rPr>
-        <w:t>NumberOfHouseholds</w:t>
+        <w:t>NumberOfHouse</w:t>
+      </w:r>
+      <w:r>
+        <w:rPr>
+          <w:lang w:val="en-ZA"/>
+        </w:rPr>
+        <w:t>h</w:t>
+      </w:r>
+      <w:r>
+        <w:rPr>
+          <w:lang w:val="en-ZA"/>
+        </w:rPr>
+        <w:t>olds</w:t>
       </w:r>
       <w:proofErr w:type="spellEnd"/>
       <w:r>
@@ -423,7 +1079,7 @@
         <w:rPr>
           <w:lang w:val="en-ZA"/>
         </w:rPr>
-        <w:t>NumberOfDams</w:t>
+        <w:t>NumberOfBoreholes</w:t>
       </w:r>
       <w:proofErr w:type="spellEnd"/>
       <w:r>
@@ -449,7 +1105,7 @@
         <w:rPr>
           <w:lang w:val="en-ZA"/>
         </w:rPr>
-        <w:t>NumberOfBoreholes</w:t>
+        <w:t>MaximumTapUsage</w:t>
       </w:r>
       <w:proofErr w:type="spellEnd"/>
       <w:r>
@@ -475,7 +1131,7 @@
         <w:rPr>
           <w:lang w:val="en-ZA"/>
         </w:rPr>
-        <w:t>NumberOfWaterSources</w:t>
+        <w:t>MaximumDamCapacity</w:t>
       </w:r>
       <w:proofErr w:type="spellEnd"/>
       <w:r>
@@ -496,19 +1152,19 @@
           <w:lang w:val="en-ZA"/>
         </w:rPr>
       </w:pPr>
-      <w:proofErr w:type="gramStart"/>
-      <w:r>
-        <w:rPr>
-          <w:lang w:val="en-ZA"/>
-        </w:rPr>
-        <w:t>Households(</w:t>
-      </w:r>
-      <w:proofErr w:type="gramEnd"/>
-      <w:r>
-        <w:rPr>
-          <w:lang w:val="en-ZA"/>
-        </w:rPr>
-        <w:t>): Integer</w:t>
+      <w:proofErr w:type="spellStart"/>
+      <w:r>
+        <w:rPr>
+          <w:lang w:val="en-ZA"/>
+        </w:rPr>
+        <w:t>ProgramInitialised</w:t>
+      </w:r>
+      <w:proofErr w:type="spellEnd"/>
+      <w:r>
+        <w:rPr>
+          <w:lang w:val="en-ZA"/>
+        </w:rPr>
+        <w:t>: Boolean</w:t>
       </w:r>
     </w:p>
     <w:p>
@@ -522,19 +1178,19 @@
           <w:lang w:val="en-ZA"/>
         </w:rPr>
       </w:pPr>
-      <w:proofErr w:type="gramStart"/>
-      <w:r>
-        <w:rPr>
-          <w:lang w:val="en-ZA"/>
-        </w:rPr>
-        <w:t>Dams(</w:t>
-      </w:r>
-      <w:proofErr w:type="gramEnd"/>
-      <w:r>
-        <w:rPr>
-          <w:lang w:val="en-ZA"/>
-        </w:rPr>
-        <w:t>): Dam</w:t>
+      <w:proofErr w:type="spellStart"/>
+      <w:r>
+        <w:rPr>
+          <w:lang w:val="en-ZA"/>
+        </w:rPr>
+        <w:t>CurrentDay</w:t>
+      </w:r>
+      <w:proofErr w:type="spellEnd"/>
+      <w:r>
+        <w:rPr>
+          <w:lang w:val="en-ZA"/>
+        </w:rPr>
+        <w:t>: Integer</w:t>
       </w:r>
     </w:p>
     <w:p>
@@ -553,14 +1209,20 @@
         <w:rPr>
           <w:lang w:val="en-ZA"/>
         </w:rPr>
-        <w:t>Boreholes(</w:t>
+        <w:t>Households(</w:t>
       </w:r>
       <w:proofErr w:type="gramEnd"/>
       <w:r>
         <w:rPr>
           <w:lang w:val="en-ZA"/>
         </w:rPr>
-        <w:t>): Borehole</w:t>
+        <w:t xml:space="preserve">): </w:t>
+      </w:r>
+      <w:r>
+        <w:rPr>
+          <w:lang w:val="en-ZA"/>
+        </w:rPr>
+        <w:t>Household</w:t>
       </w:r>
     </w:p>
     <w:p>
@@ -575,35 +1237,19 @@
         </w:rPr>
       </w:pPr>
       <w:proofErr w:type="spellStart"/>
-      <w:proofErr w:type="gramStart"/>
-      <w:r>
-        <w:rPr>
-          <w:lang w:val="en-ZA"/>
-        </w:rPr>
-        <w:t>WaterSources</w:t>
+      <w:r>
+        <w:rPr>
+          <w:lang w:val="en-ZA"/>
+        </w:rPr>
+        <w:t>AreaDam</w:t>
       </w:r>
       <w:proofErr w:type="spellEnd"/>
       <w:r>
         <w:rPr>
           <w:lang w:val="en-ZA"/>
         </w:rPr>
-        <w:t>(</w:t>
-      </w:r>
-      <w:proofErr w:type="gramEnd"/>
-      <w:r>
-        <w:rPr>
-          <w:lang w:val="en-ZA"/>
-        </w:rPr>
-        <w:t xml:space="preserve">): </w:t>
-      </w:r>
-      <w:proofErr w:type="spellStart"/>
-      <w:r>
-        <w:rPr>
-          <w:lang w:val="en-ZA"/>
-        </w:rPr>
-        <w:t>WaterSource</w:t>
-      </w:r>
-      <w:proofErr w:type="spellEnd"/>
+        <w:t>: Dam</w:t>
+      </w:r>
     </w:p>
     <w:p>
       <w:pPr>
@@ -616,19 +1262,33 @@
           <w:lang w:val="en-ZA"/>
         </w:rPr>
       </w:pPr>
-      <w:proofErr w:type="spellStart"/>
-      <w:r>
-        <w:rPr>
-          <w:lang w:val="en-ZA"/>
-        </w:rPr>
-        <w:t>MaxUsableAmountPerTap</w:t>
-      </w:r>
-      <w:proofErr w:type="spellEnd"/>
-      <w:r>
-        <w:rPr>
-          <w:lang w:val="en-ZA"/>
-        </w:rPr>
-        <w:t>: Integer</w:t>
+      <w:proofErr w:type="gramStart"/>
+      <w:r>
+        <w:rPr>
+          <w:lang w:val="en-ZA"/>
+        </w:rPr>
+        <w:t>Boreholes(</w:t>
+      </w:r>
+      <w:proofErr w:type="gramEnd"/>
+      <w:r>
+        <w:rPr>
+          <w:lang w:val="en-ZA"/>
+        </w:rPr>
+        <w:t>): Borehole</w:t>
+      </w:r>
+    </w:p>
+    <w:p>
+      <w:pPr>
+        <w:pStyle w:val="Heading5"/>
+        <w:rPr>
+          <w:lang w:val="en-ZA"/>
+        </w:rPr>
+      </w:pPr>
+      <w:r>
+        <w:rPr>
+          <w:lang w:val="en-ZA"/>
+        </w:rPr>
+        <w:t>Pseudo Code/Algorithm</w:t>
       </w:r>
     </w:p>
     <w:p>
@@ -642,33 +1302,127 @@
           <w:lang w:val="en-ZA"/>
         </w:rPr>
       </w:pPr>
+      <w:r>
+        <w:rPr>
+          <w:lang w:val="en-ZA"/>
+        </w:rPr>
+        <w:t>Initialising Program</w:t>
+      </w:r>
+    </w:p>
+    <w:p>
+      <w:pPr>
+        <w:pStyle w:val="ListParagraph"/>
+        <w:numPr>
+          <w:ilvl w:val="1"/>
+          <w:numId w:val="4"/>
+        </w:numPr>
+        <w:rPr>
+          <w:lang w:val="en-ZA"/>
+        </w:rPr>
+      </w:pPr>
+      <w:r>
+        <w:rPr>
+          <w:lang w:val="en-ZA"/>
+        </w:rPr>
+        <w:t>Instantiate Dam Object</w:t>
+      </w:r>
+    </w:p>
+    <w:p>
+      <w:pPr>
+        <w:pStyle w:val="ListParagraph"/>
+        <w:numPr>
+          <w:ilvl w:val="1"/>
+          <w:numId w:val="4"/>
+        </w:numPr>
+        <w:rPr>
+          <w:lang w:val="en-ZA"/>
+        </w:rPr>
+      </w:pPr>
+      <w:r>
+        <w:rPr>
+          <w:lang w:val="en-ZA"/>
+        </w:rPr>
+        <w:t xml:space="preserve">Instantiate all </w:t>
+      </w:r>
+      <w:r>
+        <w:rPr>
+          <w:lang w:val="en-ZA"/>
+        </w:rPr>
+        <w:t>Household objects</w:t>
+      </w:r>
+    </w:p>
+    <w:p>
+      <w:pPr>
+        <w:pStyle w:val="ListParagraph"/>
+        <w:numPr>
+          <w:ilvl w:val="1"/>
+          <w:numId w:val="4"/>
+        </w:numPr>
+        <w:rPr>
+          <w:lang w:val="en-ZA"/>
+        </w:rPr>
+      </w:pPr>
+      <w:r>
+        <w:rPr>
+          <w:lang w:val="en-ZA"/>
+        </w:rPr>
+        <w:t>Instantiate all Borehole objects</w:t>
+      </w:r>
+    </w:p>
+    <w:p>
+      <w:pPr>
+        <w:pStyle w:val="ListParagraph"/>
+        <w:numPr>
+          <w:ilvl w:val="1"/>
+          <w:numId w:val="4"/>
+        </w:numPr>
+        <w:rPr>
+          <w:lang w:val="en-ZA"/>
+        </w:rPr>
+      </w:pPr>
       <w:proofErr w:type="spellStart"/>
       <w:r>
         <w:rPr>
           <w:lang w:val="en-ZA"/>
         </w:rPr>
-        <w:t>NumberOfHouseholds</w:t>
+        <w:t>CurrentDay</w:t>
       </w:r>
       <w:proofErr w:type="spellEnd"/>
       <w:r>
         <w:rPr>
           <w:lang w:val="en-ZA"/>
         </w:rPr>
-        <w:t>: Integer</w:t>
-      </w:r>
-    </w:p>
-    <w:p>
-      <w:pPr>
-        <w:pStyle w:val="Heading5"/>
-        <w:rPr>
-          <w:lang w:val="en-ZA"/>
-        </w:rPr>
-      </w:pPr>
-      <w:r>
-        <w:rPr>
-          <w:lang w:val="en-ZA"/>
-        </w:rPr>
-        <w:t>Pseudo Code/Algorithm</w:t>
+        <w:t xml:space="preserve"> </w:t>
+      </w:r>
+      <w:r>
+        <w:rPr>
+          <w:lang w:val="en-ZA"/>
+        </w:rPr>
+        <w:sym w:font="Wingdings" w:char="F0DF"/>
+      </w:r>
+      <w:r>
+        <w:rPr>
+          <w:lang w:val="en-ZA"/>
+        </w:rPr>
+        <w:t xml:space="preserve"> 1</w:t>
+      </w:r>
+    </w:p>
+    <w:p>
+      <w:pPr>
+        <w:pStyle w:val="ListParagraph"/>
+        <w:numPr>
+          <w:ilvl w:val="1"/>
+          <w:numId w:val="4"/>
+        </w:numPr>
+        <w:rPr>
+          <w:lang w:val="en-ZA"/>
+        </w:rPr>
+      </w:pPr>
+      <w:r>
+        <w:rPr>
+          <w:lang w:val="en-ZA"/>
+        </w:rPr>
+        <w:t>Display Availability of all water sources in the area</w:t>
       </w:r>
     </w:p>
     <w:p>
@@ -678,6 +1432,380 @@
           <w:ilvl w:val="0"/>
           <w:numId w:val="4"/>
         </w:numPr>
+        <w:rPr>
+          <w:lang w:val="en-ZA"/>
+        </w:rPr>
+      </w:pPr>
+      <w:r>
+        <w:rPr>
+          <w:lang w:val="en-ZA"/>
+        </w:rPr>
+        <w:t xml:space="preserve">Using </w:t>
+      </w:r>
+      <w:r>
+        <w:rPr>
+          <w:lang w:val="en-ZA"/>
+        </w:rPr>
+        <w:t>water from Tap</w:t>
+      </w:r>
+    </w:p>
+    <w:p>
+      <w:pPr>
+        <w:pStyle w:val="ListParagraph"/>
+        <w:numPr>
+          <w:ilvl w:val="1"/>
+          <w:numId w:val="4"/>
+        </w:numPr>
+        <w:rPr>
+          <w:lang w:val="en-ZA"/>
+        </w:rPr>
+      </w:pPr>
+      <w:r>
+        <w:rPr>
+          <w:lang w:val="en-ZA"/>
+        </w:rPr>
+        <w:t xml:space="preserve">Get Household Choice from </w:t>
+      </w:r>
+      <w:r>
+        <w:rPr>
+          <w:lang w:val="en-ZA"/>
+        </w:rPr>
+        <w:t>u</w:t>
+      </w:r>
+      <w:r>
+        <w:rPr>
+          <w:lang w:val="en-ZA"/>
+        </w:rPr>
+        <w:t>ser</w:t>
+      </w:r>
+    </w:p>
+    <w:p>
+      <w:pPr>
+        <w:pStyle w:val="ListParagraph"/>
+        <w:numPr>
+          <w:ilvl w:val="1"/>
+          <w:numId w:val="4"/>
+        </w:numPr>
+        <w:rPr>
+          <w:lang w:val="en-ZA"/>
+        </w:rPr>
+      </w:pPr>
+      <w:r>
+        <w:rPr>
+          <w:lang w:val="en-ZA"/>
+        </w:rPr>
+        <w:t>Get Amount of water from the user</w:t>
+      </w:r>
+    </w:p>
+    <w:p>
+      <w:pPr>
+        <w:pStyle w:val="ListParagraph"/>
+        <w:numPr>
+          <w:ilvl w:val="1"/>
+          <w:numId w:val="4"/>
+        </w:numPr>
+        <w:rPr>
+          <w:lang w:val="en-ZA"/>
+        </w:rPr>
+      </w:pPr>
+      <w:r>
+        <w:rPr>
+          <w:lang w:val="en-ZA"/>
+        </w:rPr>
+        <w:t xml:space="preserve">If Valid </w:t>
+      </w:r>
+      <w:r>
+        <w:rPr>
+          <w:lang w:val="en-ZA"/>
+        </w:rPr>
+        <w:sym w:font="Wingdings" w:char="F0DF"/>
+      </w:r>
+      <w:r>
+        <w:rPr>
+          <w:lang w:val="en-ZA"/>
+        </w:rPr>
+        <w:t xml:space="preserve"> Draw water from the Tap</w:t>
+      </w:r>
+    </w:p>
+    <w:p>
+      <w:pPr>
+        <w:pStyle w:val="ListParagraph"/>
+        <w:numPr>
+          <w:ilvl w:val="0"/>
+          <w:numId w:val="4"/>
+        </w:numPr>
+        <w:rPr>
+          <w:lang w:val="en-ZA"/>
+        </w:rPr>
+      </w:pPr>
+      <w:r>
+        <w:rPr>
+          <w:lang w:val="en-ZA"/>
+        </w:rPr>
+        <w:t>Using Water from Borehole</w:t>
+      </w:r>
+    </w:p>
+    <w:p>
+      <w:pPr>
+        <w:pStyle w:val="ListParagraph"/>
+        <w:numPr>
+          <w:ilvl w:val="1"/>
+          <w:numId w:val="4"/>
+        </w:numPr>
+        <w:rPr>
+          <w:lang w:val="en-ZA"/>
+        </w:rPr>
+      </w:pPr>
+      <w:r>
+        <w:rPr>
+          <w:lang w:val="en-ZA"/>
+        </w:rPr>
+        <w:t>Get household choice from user</w:t>
+      </w:r>
+    </w:p>
+    <w:p>
+      <w:pPr>
+        <w:pStyle w:val="ListParagraph"/>
+        <w:numPr>
+          <w:ilvl w:val="1"/>
+          <w:numId w:val="4"/>
+        </w:numPr>
+        <w:rPr>
+          <w:lang w:val="en-ZA"/>
+        </w:rPr>
+      </w:pPr>
+      <w:r>
+        <w:rPr>
+          <w:lang w:val="en-ZA"/>
+        </w:rPr>
+        <w:t>Get borehole choice from user</w:t>
+      </w:r>
+    </w:p>
+    <w:p>
+      <w:pPr>
+        <w:pStyle w:val="ListParagraph"/>
+        <w:numPr>
+          <w:ilvl w:val="1"/>
+          <w:numId w:val="4"/>
+        </w:numPr>
+        <w:rPr>
+          <w:lang w:val="en-ZA"/>
+        </w:rPr>
+      </w:pPr>
+      <w:r>
+        <w:rPr>
+          <w:lang w:val="en-ZA"/>
+        </w:rPr>
+        <w:t>Get amount of water from user</w:t>
+      </w:r>
+    </w:p>
+    <w:p>
+      <w:pPr>
+        <w:pStyle w:val="ListParagraph"/>
+        <w:numPr>
+          <w:ilvl w:val="1"/>
+          <w:numId w:val="4"/>
+        </w:numPr>
+        <w:rPr>
+          <w:lang w:val="en-ZA"/>
+        </w:rPr>
+      </w:pPr>
+      <w:r>
+        <w:rPr>
+          <w:lang w:val="en-ZA"/>
+        </w:rPr>
+        <w:t xml:space="preserve">If Valid </w:t>
+      </w:r>
+      <w:r>
+        <w:rPr>
+          <w:lang w:val="en-ZA"/>
+        </w:rPr>
+        <w:sym w:font="Wingdings" w:char="F0DF"/>
+      </w:r>
+      <w:r>
+        <w:rPr>
+          <w:lang w:val="en-ZA"/>
+        </w:rPr>
+        <w:t xml:space="preserve"> Draw water from the borehole</w:t>
+      </w:r>
+    </w:p>
+    <w:p>
+      <w:pPr>
+        <w:pStyle w:val="ListParagraph"/>
+        <w:numPr>
+          <w:ilvl w:val="0"/>
+          <w:numId w:val="4"/>
+        </w:numPr>
+        <w:rPr>
+          <w:lang w:val="en-ZA"/>
+        </w:rPr>
+      </w:pPr>
+      <w:r>
+        <w:rPr>
+          <w:lang w:val="en-ZA"/>
+        </w:rPr>
+        <w:t>Viewing Household profile</w:t>
+      </w:r>
+    </w:p>
+    <w:p>
+      <w:pPr>
+        <w:pStyle w:val="ListParagraph"/>
+        <w:numPr>
+          <w:ilvl w:val="1"/>
+          <w:numId w:val="4"/>
+        </w:numPr>
+        <w:rPr>
+          <w:lang w:val="en-ZA"/>
+        </w:rPr>
+      </w:pPr>
+      <w:r>
+        <w:rPr>
+          <w:lang w:val="en-ZA"/>
+        </w:rPr>
+        <w:t>Get household choice from the user</w:t>
+      </w:r>
+    </w:p>
+    <w:p>
+      <w:pPr>
+        <w:pStyle w:val="ListParagraph"/>
+        <w:numPr>
+          <w:ilvl w:val="1"/>
+          <w:numId w:val="4"/>
+        </w:numPr>
+        <w:rPr>
+          <w:lang w:val="en-ZA"/>
+        </w:rPr>
+      </w:pPr>
+      <w:r>
+        <w:rPr>
+          <w:lang w:val="en-ZA"/>
+        </w:rPr>
+        <w:t xml:space="preserve">If choice is valid </w:t>
+      </w:r>
+      <w:r>
+        <w:rPr>
+          <w:lang w:val="en-ZA"/>
+        </w:rPr>
+        <w:sym w:font="Wingdings" w:char="F0DF"/>
+      </w:r>
+      <w:r>
+        <w:rPr>
+          <w:lang w:val="en-ZA"/>
+        </w:rPr>
+        <w:t xml:space="preserve"> </w:t>
+      </w:r>
+      <w:r>
+        <w:rPr>
+          <w:lang w:val="en-ZA"/>
+        </w:rPr>
+        <w:t>Display the current usage of the household</w:t>
+      </w:r>
+    </w:p>
+    <w:p>
+      <w:pPr>
+        <w:pStyle w:val="ListParagraph"/>
+        <w:numPr>
+          <w:ilvl w:val="0"/>
+          <w:numId w:val="4"/>
+        </w:numPr>
+        <w:rPr>
+          <w:lang w:val="en-ZA"/>
+        </w:rPr>
+      </w:pPr>
+      <w:r>
+        <w:rPr>
+          <w:lang w:val="en-ZA"/>
+        </w:rPr>
+        <w:t>Moving to the next day</w:t>
+      </w:r>
+    </w:p>
+    <w:p>
+      <w:pPr>
+        <w:pStyle w:val="ListParagraph"/>
+        <w:numPr>
+          <w:ilvl w:val="1"/>
+          <w:numId w:val="4"/>
+        </w:numPr>
+        <w:rPr>
+          <w:lang w:val="en-ZA"/>
+        </w:rPr>
+      </w:pPr>
+      <w:r>
+        <w:rPr>
+          <w:lang w:val="en-ZA"/>
+        </w:rPr>
+        <w:t>Reset available amount from each borehole to the defaults rate</w:t>
+      </w:r>
+    </w:p>
+    <w:p>
+      <w:pPr>
+        <w:pStyle w:val="ListParagraph"/>
+        <w:numPr>
+          <w:ilvl w:val="1"/>
+          <w:numId w:val="4"/>
+        </w:numPr>
+        <w:rPr>
+          <w:lang w:val="en-ZA"/>
+        </w:rPr>
+      </w:pPr>
+      <w:r>
+        <w:rPr>
+          <w:lang w:val="en-ZA"/>
+        </w:rPr>
+        <w:t>IF: Day = 1</w:t>
+      </w:r>
+    </w:p>
+    <w:p>
+      <w:pPr>
+        <w:pStyle w:val="ListParagraph"/>
+        <w:numPr>
+          <w:ilvl w:val="2"/>
+          <w:numId w:val="4"/>
+        </w:numPr>
+        <w:rPr>
+          <w:lang w:val="en-ZA"/>
+        </w:rPr>
+      </w:pPr>
+      <w:r>
+        <w:rPr>
+          <w:lang w:val="en-ZA"/>
+        </w:rPr>
+        <w:t xml:space="preserve">Reset </w:t>
+      </w:r>
+      <w:r>
+        <w:rPr>
+          <w:lang w:val="en-ZA"/>
+        </w:rPr>
+        <w:t>tap usage to default for each household</w:t>
+      </w:r>
+    </w:p>
+    <w:p>
+      <w:pPr>
+        <w:pStyle w:val="ListParagraph"/>
+        <w:numPr>
+          <w:ilvl w:val="2"/>
+          <w:numId w:val="4"/>
+        </w:numPr>
+        <w:rPr>
+          <w:lang w:val="en-ZA"/>
+        </w:rPr>
+      </w:pPr>
+      <w:r>
+        <w:rPr>
+          <w:lang w:val="en-ZA"/>
+        </w:rPr>
+        <w:t>Reset Dam available amount to maximum capacity</w:t>
+      </w:r>
+    </w:p>
+    <w:p>
+      <w:pPr>
+        <w:rPr>
+          <w:lang w:val="en-ZA"/>
+        </w:rPr>
+      </w:pPr>
+    </w:p>
+    <w:p>
+      <w:pPr>
         <w:rPr>
           <w:lang w:val="en-ZA"/>
         </w:rPr>
@@ -688,12 +1816,6 @@
           <w:docGrid w:linePitch="360"/>
         </w:sectPr>
       </w:pPr>
-      <w:r>
-        <w:rPr>
-          <w:lang w:val="en-ZA"/>
-        </w:rPr>
-        <w:t>.</w:t>
-      </w:r>
     </w:p>
     <w:p>
       <w:pPr>
@@ -716,6 +1838,73 @@
           <w:lang w:val="en-ZA"/>
         </w:rPr>
       </w:pPr>
+      <w:r>
+        <w:rPr>
+          <w:lang w:val="en-ZA"/>
+        </w:rPr>
+        <w:drawing>
+          <wp:inline distT="0" distB="0" distL="0" distR="0" wp14:anchorId="3D015F7C" wp14:editId="2C50542E">
+            <wp:extent cx="8134184" cy="4213084"/>
+            <wp:effectExtent l="19050" t="19050" r="19685" b="16510"/>
+            <wp:docPr id="1243607294" name="Picture 1"/>
+            <wp:cNvGraphicFramePr>
+              <a:graphicFrameLocks xmlns:a="http://schemas.openxmlformats.org/drawingml/2006/main" noChangeAspect="1"/>
+            </wp:cNvGraphicFramePr>
+            <a:graphic xmlns:a="http://schemas.openxmlformats.org/drawingml/2006/main">
+              <a:graphicData uri="http://schemas.openxmlformats.org/drawingml/2006/picture">
+                <pic:pic xmlns:pic="http://schemas.openxmlformats.org/drawingml/2006/picture">
+                  <pic:nvPicPr>
+                    <pic:cNvPr id="1243607294" name=""/>
+                    <pic:cNvPicPr/>
+                  </pic:nvPicPr>
+                  <pic:blipFill rotWithShape="1">
+                    <a:blip r:embed="rId5"/>
+                    <a:srcRect l="484" t="1099" r="650" b="1848"/>
+                    <a:stretch>
+                      <a:fillRect/>
+                    </a:stretch>
+                  </pic:blipFill>
+                  <pic:spPr bwMode="auto">
+                    <a:xfrm>
+                      <a:off x="0" y="0"/>
+                      <a:ext cx="8136314" cy="4214187"/>
+                    </a:xfrm>
+                    <a:prstGeom prst="rect">
+                      <a:avLst/>
+                    </a:prstGeom>
+                    <a:ln w="19050">
+                      <a:solidFill>
+                        <a:schemeClr val="tx1"/>
+                      </a:solidFill>
+                    </a:ln>
+                    <a:extLst>
+                      <a:ext uri="{53640926-AAD7-44D8-BBD7-CCE9431645EC}">
+                        <a14:shadowObscured xmlns:a14="http://schemas.microsoft.com/office/drawing/2010/main"/>
+                      </a:ext>
+                    </a:extLst>
+                  </pic:spPr>
+                </pic:pic>
+              </a:graphicData>
+            </a:graphic>
+          </wp:inline>
+        </w:drawing>
+      </w:r>
+    </w:p>
+    <w:p>
+      <w:pPr>
+        <w:rPr>
+          <w:rFonts w:asciiTheme="majorHAnsi" w:eastAsiaTheme="majorEastAsia" w:hAnsiTheme="majorHAnsi" w:cstheme="majorBidi"/>
+          <w:b/>
+          <w:bCs/>
+          <w:lang w:val="en-ZA"/>
+        </w:rPr>
+      </w:pPr>
+      <w:r>
+        <w:rPr>
+          <w:lang w:val="en-ZA"/>
+        </w:rPr>
+        <w:br w:type="page"/>
+      </w:r>
     </w:p>
     <w:p>
       <w:pPr>
@@ -728,6 +1917,7 @@
         <w:rPr>
           <w:lang w:val="en-ZA"/>
         </w:rPr>
+        <w:lastRenderedPageBreak/>
         <w:t>Test Data</w:t>
       </w:r>
     </w:p>
@@ -753,7 +1943,7 @@
   <w:abstractNum w:abstractNumId="0" w15:restartNumberingAfterBreak="0">
     <w:nsid w:val="0B932DA3"/>
     <w:multiLevelType w:val="hybridMultilevel"/>
-    <w:tmpl w:val="88F49986"/>
+    <w:tmpl w:val="54861C86"/>
     <w:lvl w:ilvl="0" w:tplc="04090001">
       <w:start w:val="1"/>
       <w:numFmt w:val="bullet"/>
@@ -766,7 +1956,7 @@
         <w:rFonts w:ascii="Symbol" w:hAnsi="Symbol" w:hint="default"/>
       </w:rPr>
     </w:lvl>
-    <w:lvl w:ilvl="1" w:tplc="04090003" w:tentative="1">
+    <w:lvl w:ilvl="1" w:tplc="04090003">
       <w:start w:val="1"/>
       <w:numFmt w:val="bullet"/>
       <w:lvlText w:val="o"/>
@@ -778,7 +1968,7 @@
         <w:rFonts w:ascii="Courier New" w:hAnsi="Courier New" w:cs="Courier New" w:hint="default"/>
       </w:rPr>
     </w:lvl>
-    <w:lvl w:ilvl="2" w:tplc="04090005" w:tentative="1">
+    <w:lvl w:ilvl="2" w:tplc="04090005">
       <w:start w:val="1"/>
       <w:numFmt w:val="bullet"/>
       <w:lvlText w:val=""/>
@@ -1935,7 +3125,6 @@
   <w:style w:type="character" w:default="1" w:styleId="DefaultParagraphFont">
     <w:name w:val="Default Paragraph Font"/>
     <w:uiPriority w:val="1"/>
-    <w:semiHidden/>
     <w:unhideWhenUsed/>
   </w:style>
   <w:style w:type="table" w:default="1" w:styleId="TableNormal">

</xml_diff>